<commit_message>
Add a checked Sources and go deeper block to every room and download.
Each room keeps a sources.json. Papers, specs, vendor docs, community pages, and Wikipedia fallbacks are linked with last checked 2026-10. Pages that did not open are marked confirm.

Co-authored-by: CYPHER0X9 <cipher0x9@users.noreply.github.com>
</commit_message>
<xml_diff>
--- a/downloads/templates/agent-trace.docx
+++ b/downloads/templates/agent-trace.docx
@@ -48,6 +48,59 @@
     <w:p>
       <w:r>
         <w:t xml:space="preserve">Approver: </w:t>
+      </w:r>
+    </w:p>
+    <w:p>
+      <w:pPr>
+        <w:pStyle w:val="Heading1"/>
+      </w:pPr>
+      <w:r>
+        <w:t>Sources and go deeper</w:t>
+      </w:r>
+    </w:p>
+    <w:p>
+      <w:r>
+        <w:t>Yao and co-authors, ReAct: Synergizing Reasoning and Acting in Language Models, 2022 (paper)</w:t>
+      </w:r>
+    </w:p>
+    <w:p>
+      <w:r>
+        <w:t>last checked 2026-10</w:t>
+      </w:r>
+    </w:p>
+    <w:p>
+      <w:r>
+        <w:t>https://arxiv.org/abs/2210.03629</w:t>
+      </w:r>
+    </w:p>
+    <w:p>
+      <w:r>
+        <w:t>Anthropic, Building effective agents (vendor)</w:t>
+      </w:r>
+    </w:p>
+    <w:p>
+      <w:r>
+        <w:t>last checked 2026-10</w:t>
+      </w:r>
+    </w:p>
+    <w:p>
+      <w:r>
+        <w:t>https://www.anthropic.com/engineering/building-effective-agents</w:t>
+      </w:r>
+    </w:p>
+    <w:p>
+      <w:r>
+        <w:t>Large language model — Wikipedia (wikipedia)</w:t>
+      </w:r>
+    </w:p>
+    <w:p>
+      <w:r>
+        <w:t>last checked 2026-10</w:t>
+      </w:r>
+    </w:p>
+    <w:p>
+      <w:r>
+        <w:t>https://en.wikipedia.org/wiki/Large_language_model</w:t>
       </w:r>
     </w:p>
     <w:sectPr>

</xml_diff>